<commit_message>
AL-202 update ibrahima's AL-20 test case and AL-5 use case now that #79 is merged and #98 is open
</commit_message>
<xml_diff>
--- a/docs/sprint-1-submission/ibrahima/AL-20/test-case.docx
+++ b/docs/sprint-1-submission/ibrahima/AL-20/test-case.docx
@@ -233,7 +233,7 @@
               <w:rPr>
                 <w:sz w:val="19"/>
               </w:rPr>
-              <w:t>al-mobile/AgenticLender/Application: the form and draft on main (PR #61, merged 22 Oct), edit a draft in PR #79 and review and submit on the local AL-100 branch, repository CS3-Agentic-Lender/agentic-lender</w:t>
+              <w:t>al-mobile/AgenticLender/Application: the form and draft (PR #61, merged 22 Oct) and edit a draft (PR #79, merged 23 Oct) on main; review and submit in PR #98 (opened 23 Oct, in review), repository CS3-Agentic-Lender/agentic-lender</w:t>
             </w:r>
           </w:p>
         </w:tc>
@@ -339,7 +339,7 @@
         <w:pStyle w:val="ListBullet"/>
       </w:pPr>
       <w:r>
-        <w:t>Unit test results: 284 tests on PR #61 just before it merged into main (22 Oct), 221 on PR #79 (19 Oct) and 252 on the local AL-100 branch (20 Oct). 0 failures.</w:t>
+        <w:t>Unit test results: 284 tests on PR #61 just before it merged into main (22 Oct), 315 on PR #79 before it merged (22 Oct) and 345 on the PR #98 branch (23 Oct). 0 failures.</w:t>
       </w:r>
     </w:p>
     <w:p>
@@ -661,7 +661,7 @@
               <w:rPr>
                 <w:sz w:val="19"/>
               </w:rPr>
-              <w:t>Automated (local AL-100 branch): ApplicationSubmitViewModelTests &gt; testSubmitAsksForConfirmationFirstAndSendsNothing, testCancellingTheConfirmationLeavesTheDraftAlone, testConfirmingSubmitsTheSavedDraftAndShowsItsReference; ApplicationReviewTests &gt; testTheReferenceIsTheFirstEightCharactersOfTheIDInCapitals; APIApplicationServiceTests &gt; testConflictMeansAnApplicationIsAlreadyInProgress. End to end (20 Oct): submit returned 200, and the Firestore emulator shows the application as Applied with a submittedAt time (Ref UJQJVQ6Y); alice's save was refused with 409. Pass on the local branch; no PR yet.</w:t>
+              <w:t>Automated (PR #98 branch): ApplicationSubmitViewModelTests &gt; testSubmitAsksForConfirmationFirstAndSendsNothing, testCancellingTheConfirmationLeavesTheDraftAlone, testConfirmingSubmitsTheSavedDraftAndShowsItsReference; ApplicationReviewTests &gt; testTheReferenceIsTheFirstEightCharactersOfTheIDInCapitals; APIApplicationServiceTests &gt; testConflictMeansAnApplicationIsAlreadyInProgress. End to end (23 Oct, a new borrower on the PR #98 branch): Cancel sent nothing and Confirm sent one submit call (200); the Firestore emulator shows the application as Applied with a submittedAt time (Ref MR6HHYDW), and Back to home opened a fresh home screen. Alice's save was refused with 409. Pass on the PR #98 branch, in review.</w:t>
             </w:r>
           </w:p>
         </w:tc>
@@ -728,7 +728,7 @@
               <w:rPr>
                 <w:sz w:val="19"/>
               </w:rPr>
-              <w:t>Automated (PR #79 branch): ApplicationDraftEditingTests &gt; testReopeningFillsTheFormWithTheSavedDraft, testADraftCanBeChangedAndSavesToTheSameDraft, testASubmittedApplicationOpensReadOnlyAndCannotBeSaved. End to end (19 Oct): PATCH returned 200 and the changes read back; a PATCH after submitting was refused with 409 ("Only a Draft can be edited"). Pass on the branch.</w:t>
+              <w:t>Automated (PR #79 branch): ApplicationDraftEditingTests &gt; testReopeningFillsTheFormWithTheSavedDraft, testADraftCanBeChangedAndSavesToTheSameDraft, testASubmittedApplicationOpensReadOnlyAndCannotBeSaved. End to end (19 Oct): PATCH returned 200 and the changes read back; a PATCH after submitting was refused with 409 ("Only a Draft can be edited"). Pass (on main, PR #79 merged 23 Oct).</w:t>
             </w:r>
           </w:p>
         </w:tc>
@@ -815,7 +815,15 @@
         <w:pStyle w:val="ListBullet"/>
       </w:pPr>
       <w:r>
-        <w:t>The form and draft (AL-99, PR #61) merged on 22 Oct. Not merged yet: edit a draft (AL-101, PR #79) is being rebuilt from main, and review and submit (AL-100) is on a local branch and gets its PR after #79.</w:t>
+        <w:t>The form and draft (AL-99, PR #61) merged on 22 Oct and edit a draft (AL-101, PR #79) on 23 Oct. Review and submit (AL-100) is in PR #98, opened 23 Oct and waiting for review.</w:t>
+      </w:r>
+    </w:p>
+    <w:p>
+      <w:pPr>
+        <w:pStyle w:val="ListBullet"/>
+      </w:pPr>
+      <w:r>
+        <w:t>Review has one Edit link per card (You, Your money, Your loan, The home), each opening its part of the form, rather than one per field.</w:t>
       </w:r>
     </w:p>
     <w:p>

</xml_diff>